<commit_message>
udpated the intenal template
</commit_message>
<xml_diff>
--- a/public/templates/external.docx
+++ b/public/templates/external.docx
@@ -7,7 +7,7 @@
         <w:pStyle w:val="Heading3"/>
         <w:rPr/>
       </w:pPr>
-      <w:bookmarkStart w:colFirst="0" w:colLast="0" w:name="_8ftlevnaevnl" w:id="0"/>
+      <w:bookmarkStart w:colFirst="0" w:colLast="0" w:name="_x8fm1uorkbaw" w:id="0"/>
       <w:bookmarkEnd w:id="0"/>
       <w:r>
         <w:rPr>
@@ -21,7 +21,7 @@
         <w:pStyle w:val="Title"/>
         <w:rPr/>
       </w:pPr>
-      <w:bookmarkStart w:colFirst="0" w:colLast="0" w:name="_2aqqqojb8wx4" w:id="1"/>
+      <w:bookmarkStart w:colFirst="0" w:colLast="0" w:name="_7c1qwp3bc7si" w:id="1"/>
       <w:bookmarkEnd w:id="1"/>
       <w:r>
         <w:rPr>
@@ -42,7 +42,7 @@
             <wp:extent cx="1939727" cy="620713"/>
             <wp:effectExtent b="0" l="0" r="0" t="0"/>
             <wp:wrapSquare wrapText="bothSides" distB="114300" distT="114300" distL="114300" distR="114300"/>
-            <wp:docPr id="1" name="image2.png"/>
+            <wp:docPr id="2" name="image2.png"/>
             <a:graphic>
               <a:graphicData uri="http://schemas.openxmlformats.org/drawingml/2006/picture">
                 <pic:pic>
@@ -77,11 +77,12 @@
         <w:pStyle w:val="Subtitle"/>
         <w:tabs>
           <w:tab w:val="left" w:leader="none" w:pos="1260"/>
-          <w:tab w:val="left" w:leader="none" w:pos="1260"/>
         </w:tabs>
-        <w:rPr/>
-      </w:pPr>
-      <w:bookmarkStart w:colFirst="0" w:colLast="0" w:name="_5jj7d4vkct2x" w:id="2"/>
+        <w:rPr>
+          <w:rFonts w:ascii="Lexend" w:cs="Lexend" w:eastAsia="Lexend" w:hAnsi="Lexend"/>
+        </w:rPr>
+      </w:pPr>
+      <w:bookmarkStart w:colFirst="0" w:colLast="0" w:name="_ymi089liagec" w:id="2"/>
       <w:bookmarkEnd w:id="2"/>
       <w:r>
         <w:rPr>
@@ -89,6 +90,11 @@
         </w:rPr>
         <w:t xml:space="preserve">{jobTitle}</w:t>
       </w:r>
+      <w:r>
+        <w:rPr>
+          <w:rtl w:val="0"/>
+        </w:rPr>
+      </w:r>
     </w:p>
     <w:p>
       <w:pPr>
@@ -139,7 +145,7 @@
         <w:pStyle w:val="Heading1"/>
         <w:rPr/>
       </w:pPr>
-      <w:bookmarkStart w:colFirst="0" w:colLast="0" w:name="_669yqqkowkng" w:id="3"/>
+      <w:bookmarkStart w:colFirst="0" w:colLast="0" w:name="_infkfwdic09e" w:id="3"/>
       <w:bookmarkEnd w:id="3"/>
       <w:r>
         <w:rPr>
@@ -175,7 +181,7 @@
         <w:pStyle w:val="Heading1"/>
         <w:rPr/>
       </w:pPr>
-      <w:bookmarkStart w:colFirst="0" w:colLast="0" w:name="_w681s0h5losi" w:id="4"/>
+      <w:bookmarkStart w:colFirst="0" w:colLast="0" w:name="_wc3sbuf0jvp2" w:id="4"/>
       <w:bookmarkEnd w:id="4"/>
       <w:r>
         <w:rPr>
@@ -185,22 +191,17 @@
       </w:r>
     </w:p>
     <w:p>
-      <w:pPr>
-        <w:rPr/>
-      </w:pPr>
-      <w:r>
-        <w:rPr>
-          <w:rtl w:val="0"/>
-        </w:rPr>
+      <w:r>
         <w:t xml:space="preserve">{#education}</w:t>
       </w:r>
     </w:p>
     <w:p>
       <w:pPr>
         <w:pStyle w:val="Heading2"/>
-        <w:rPr/>
-      </w:pPr>
-      <w:bookmarkStart w:colFirst="0" w:colLast="0" w:name="_skdfj7lvk07x" w:id="5"/>
+        <w:spacing w:before="40" w:line="360" w:lineRule="auto"/>
+        <w:rPr/>
+      </w:pPr>
+      <w:bookmarkStart w:colFirst="0" w:colLast="0" w:name="_u88f26961k8s" w:id="5"/>
       <w:bookmarkEnd w:id="5"/>
       <w:r>
         <w:rPr>
@@ -221,13 +222,7 @@
       </w:r>
     </w:p>
     <w:p>
-      <w:pPr>
-        <w:rPr/>
-      </w:pPr>
-      <w:r>
-        <w:rPr>
-          <w:rtl w:val="0"/>
-        </w:rPr>
+      <w:r>
         <w:t xml:space="preserve">{/education}</w:t>
       </w:r>
     </w:p>
@@ -251,7 +246,7 @@
         <w:pStyle w:val="Heading1"/>
         <w:rPr/>
       </w:pPr>
-      <w:bookmarkStart w:colFirst="0" w:colLast="0" w:name="_6kr8tla6ogcg" w:id="6"/>
+      <w:bookmarkStart w:colFirst="0" w:colLast="0" w:name="_b929wjmkc7pq" w:id="6"/>
       <w:bookmarkEnd w:id="6"/>
       <w:r>
         <w:rPr>
@@ -281,13 +276,18 @@
         </w:rPr>
         <w:t xml:space="preserve"> </w:t>
       </w:r>
+      <w:r>
+        <w:rPr>
+          <w:rtl w:val="0"/>
+        </w:rPr>
+      </w:r>
     </w:p>
     <w:p>
       <w:pPr>
         <w:pStyle w:val="Heading1"/>
         <w:rPr/>
       </w:pPr>
-      <w:bookmarkStart w:colFirst="0" w:colLast="0" w:name="_2i5zm1pymy1" w:id="7"/>
+      <w:bookmarkStart w:colFirst="0" w:colLast="0" w:name="_vt04c6p4mz9l" w:id="7"/>
       <w:bookmarkEnd w:id="7"/>
       <w:r>
         <w:rPr>
@@ -323,33 +323,45 @@
         <w:pStyle w:val="Heading1"/>
         <w:rPr/>
       </w:pPr>
-      <w:bookmarkStart w:colFirst="0" w:colLast="0" w:name="_i0h835sgsycw" w:id="8"/>
+      <w:bookmarkStart w:colFirst="0" w:colLast="0" w:name="_xpiuea7v64mg" w:id="8"/>
       <w:bookmarkEnd w:id="8"/>
       <w:r>
         <w:rPr>
           <w:rtl w:val="0"/>
         </w:rPr>
-        <w:t xml:space="preserve">Projects/Experience </w:t>
-      </w:r>
-    </w:p>
-    <w:p>
-      <w:pPr>
-        <w:rPr/>
-      </w:pPr>
-      <w:r>
-        <w:rPr>
-          <w:rtl w:val="0"/>
-        </w:rPr>
+        <w:t xml:space="preserve">P</w:t>
+      </w:r>
+      <w:r>
+        <w:rPr>
+          <w:rtl w:val="0"/>
+        </w:rPr>
+        <w:t xml:space="preserve">rojects</w:t>
+      </w:r>
+      <w:r>
+        <w:rPr>
+          <w:rtl w:val="0"/>
+        </w:rPr>
+        <w:t xml:space="preserve">/Experience</w:t>
+      </w:r>
+      <w:r>
+        <w:rPr>
+          <w:rtl w:val="0"/>
+        </w:rPr>
+        <w:t xml:space="preserve"> </w:t>
+      </w:r>
+    </w:p>
+    <w:p>
+      <w:r>
         <w:t xml:space="preserve">{#projects}</w:t>
       </w:r>
     </w:p>
     <w:p>
       <w:pPr>
         <w:pStyle w:val="Heading2"/>
-        <w:spacing w:line="273.6" w:lineRule="auto"/>
-        <w:rPr/>
-      </w:pPr>
-      <w:bookmarkStart w:colFirst="0" w:colLast="0" w:name="_hg7oe0ffqogz" w:id="9"/>
+        <w:spacing w:before="40" w:line="273.6" w:lineRule="auto"/>
+        <w:rPr/>
+      </w:pPr>
+      <w:bookmarkStart w:colFirst="0" w:colLast="0" w:name="_sk0v8qpkdxob" w:id="9"/>
       <w:bookmarkEnd w:id="9"/>
       <w:r>
         <w:rPr>
@@ -383,10 +395,10 @@
     <w:p>
       <w:pPr>
         <w:pStyle w:val="Heading2"/>
-        <w:spacing w:line="273.6" w:lineRule="auto"/>
-        <w:rPr/>
-      </w:pPr>
-      <w:bookmarkStart w:colFirst="0" w:colLast="0" w:name="_mrb7qm3x8bi" w:id="10"/>
+        <w:spacing w:before="40" w:line="273.6" w:lineRule="auto"/>
+        <w:rPr/>
+      </w:pPr>
+      <w:bookmarkStart w:colFirst="0" w:colLast="0" w:name="_xv20hrw0vxgs" w:id="10"/>
       <w:bookmarkEnd w:id="10"/>
       <w:r>
         <w:rPr>
@@ -420,10 +432,10 @@
     <w:p>
       <w:pPr>
         <w:pStyle w:val="Heading2"/>
-        <w:spacing w:line="273.6" w:lineRule="auto"/>
-        <w:rPr/>
-      </w:pPr>
-      <w:bookmarkStart w:colFirst="0" w:colLast="0" w:name="_5zpoxtlu443d" w:id="11"/>
+        <w:spacing w:before="40" w:line="273.6" w:lineRule="auto"/>
+        <w:rPr/>
+      </w:pPr>
+      <w:bookmarkStart w:colFirst="0" w:colLast="0" w:name="_n00xtxszsxk7" w:id="11"/>
       <w:bookmarkEnd w:id="11"/>
       <w:r>
         <w:rPr>
@@ -475,14 +487,142 @@
       </w:r>
     </w:p>
     <w:p>
-      <w:pPr>
-        <w:rPr/>
-      </w:pPr>
-      <w:r>
-        <w:rPr>
-          <w:rtl w:val="0"/>
-        </w:rPr>
+      <w:r>
         <w:t xml:space="preserve">{#responsibilities}</w:t>
+      </w:r>
+    </w:p>
+    <w:p>
+      <w:pPr>
+        <w:numPr>
+          <w:ilvl w:val="0"/>
+          <w:numId w:val="1"/>
+        </w:numPr>
+        <w:ind w:left="720" w:hanging="360"/>
+        <w:rPr>
+          <w:u w:val="none"/>
+        </w:rPr>
+      </w:pPr>
+      <w:r>
+        <w:rPr>
+          <w:rtl w:val="0"/>
+        </w:rPr>
+        <w:t xml:space="preserve">{.}</w:t>
+      </w:r>
+    </w:p>
+    <w:p>
+      <w:r>
+        <w:t xml:space="preserve">{/responsibilities}</w:t>
+      </w:r>
+    </w:p>
+    <w:p>
+      <w:pPr>
+        <w:rPr/>
+      </w:pPr>
+      <w:r>
+        <w:rPr>
+          <w:rtl w:val="0"/>
+        </w:rPr>
+      </w:r>
+    </w:p>
+    <w:p>
+      <w:pPr>
+        <w:rPr/>
+      </w:pPr>
+      <w:r>
+        <w:rPr>
+          <w:rtl w:val="0"/>
+        </w:rPr>
+      </w:r>
+    </w:p>
+    <w:p>
+      <w:r>
+        <w:t xml:space="preserve">{/projects}</w:t>
+      </w:r>
+    </w:p>
+    <w:p>
+      <w:pPr>
+        <w:spacing w:before="40" w:line="273.6" w:lineRule="auto"/>
+        <w:rPr/>
+      </w:pPr>
+      <w:r>
+        <w:rPr>
+          <w:rtl w:val="0"/>
+        </w:rPr>
+      </w:r>
+    </w:p>
+    <w:p>
+      <w:pPr>
+        <w:pStyle w:val="Heading1"/>
+        <w:rPr/>
+      </w:pPr>
+      <w:bookmarkStart w:colFirst="0" w:colLast="0" w:name="_7vwr3e79orwt" w:id="12"/>
+      <w:bookmarkEnd w:id="12"/>
+      <w:r>
+        <w:rPr>
+          <w:rtl w:val="0"/>
+        </w:rPr>
+        <w:t xml:space="preserve">Experience</w:t>
+      </w:r>
+    </w:p>
+    <w:p>
+      <w:r>
+        <w:t xml:space="preserve">{#experience}</w:t>
+      </w:r>
+    </w:p>
+    <w:p>
+      <w:pPr>
+        <w:pStyle w:val="Heading2"/>
+        <w:rPr/>
+      </w:pPr>
+      <w:bookmarkStart w:colFirst="0" w:colLast="0" w:name="_gfiut3vv9g0y" w:id="13"/>
+      <w:bookmarkEnd w:id="13"/>
+      <w:r>
+        <w:rPr>
+          <w:rtl w:val="0"/>
+        </w:rPr>
+        <w:t xml:space="preserve">{company}</w:t>
+      </w:r>
+    </w:p>
+    <w:p>
+      <w:pPr>
+        <w:rPr/>
+      </w:pPr>
+      <w:r>
+        <w:rPr>
+          <w:rtl w:val="0"/>
+        </w:rPr>
+        <w:t xml:space="preserve">{position}</w:t>
+      </w:r>
+    </w:p>
+    <w:p>
+      <w:pPr>
+        <w:rPr/>
+      </w:pPr>
+      <w:r>
+        <w:rPr>
+          <w:rtl w:val="0"/>
+        </w:rPr>
+        <w:t xml:space="preserve">{duration}</w:t>
+      </w:r>
+    </w:p>
+    <w:p>
+      <w:pPr>
+        <w:spacing w:line="240" w:lineRule="auto"/>
+        <w:jc w:val="left"/>
+        <w:rPr>
+          <w:sz w:val="18"/>
+          <w:szCs w:val="18"/>
+        </w:rPr>
+      </w:pPr>
+      <w:r>
+        <w:rPr>
+          <w:rtl w:val="0"/>
+        </w:rPr>
+      </w:r>
+    </w:p>
+    <w:p>
+      <w:r>
+        <w:t xml:space="preserve">{#highlights}</w:t>
       </w:r>
     </w:p>
     <w:p>
@@ -492,10 +632,7 @@
           <w:numId w:val="2"/>
         </w:numPr>
         <w:ind w:left="720" w:hanging="360"/>
-        <w:rPr>
-          <w:sz w:val="18"/>
-          <w:szCs w:val="18"/>
-        </w:rPr>
+        <w:rPr/>
       </w:pPr>
       <w:r>
         <w:rPr>
@@ -505,195 +642,13 @@
       </w:r>
     </w:p>
     <w:p>
-      <w:pPr>
-        <w:rPr/>
-      </w:pPr>
-      <w:r>
-        <w:rPr>
-          <w:rtl w:val="0"/>
-        </w:rPr>
-        <w:t xml:space="preserve">{/responsibilities}</w:t>
-      </w:r>
-    </w:p>
-    <w:p>
-      <w:pPr>
-        <w:rPr/>
-      </w:pPr>
-      <w:r>
-        <w:rPr>
-          <w:rtl w:val="0"/>
-        </w:rPr>
-      </w:r>
-    </w:p>
-    <w:p>
-      <w:pPr>
-        <w:rPr/>
-      </w:pPr>
-      <w:r>
-        <w:rPr>
-          <w:rtl w:val="0"/>
-        </w:rPr>
-      </w:r>
-    </w:p>
-    <w:p>
-      <w:pPr>
-        <w:rPr/>
-      </w:pPr>
-      <w:r>
-        <w:rPr>
-          <w:rtl w:val="0"/>
-        </w:rPr>
-        <w:t xml:space="preserve">{/projects}</w:t>
-      </w:r>
-    </w:p>
-    <w:p>
-      <w:pPr>
-        <w:spacing w:before="40" w:line="273.6" w:lineRule="auto"/>
-        <w:rPr/>
-      </w:pPr>
-      <w:r>
-        <w:rPr>
-          <w:rtl w:val="0"/>
-        </w:rPr>
-      </w:r>
-    </w:p>
-    <w:p>
-      <w:pPr>
-        <w:pStyle w:val="Heading1"/>
-        <w:rPr/>
-      </w:pPr>
-      <w:bookmarkStart w:colFirst="0" w:colLast="0" w:name="_rcelfbcdz62v" w:id="12"/>
-      <w:bookmarkEnd w:id="12"/>
-      <w:r>
-        <w:rPr>
-          <w:rtl w:val="0"/>
-        </w:rPr>
-        <w:t xml:space="preserve">Experience</w:t>
-      </w:r>
-    </w:p>
-    <w:p>
-      <w:pPr>
-        <w:rPr/>
-      </w:pPr>
-      <w:r>
-        <w:rPr>
-          <w:rtl w:val="0"/>
-        </w:rPr>
-        <w:t xml:space="preserve">{#experience}</w:t>
-      </w:r>
-    </w:p>
-    <w:p>
-      <w:pPr>
-        <w:pStyle w:val="Heading2"/>
-        <w:rPr/>
-      </w:pPr>
-      <w:bookmarkStart w:colFirst="0" w:colLast="0" w:name="_lt001p9yu1y8" w:id="13"/>
-      <w:bookmarkEnd w:id="13"/>
-      <w:r>
-        <w:rPr>
-          <w:rtl w:val="0"/>
-        </w:rPr>
-        <w:t xml:space="preserve">{company}</w:t>
-      </w:r>
-    </w:p>
-    <w:p>
-      <w:pPr>
-        <w:rPr/>
-      </w:pPr>
-      <w:r>
-        <w:rPr>
-          <w:rtl w:val="0"/>
-        </w:rPr>
-        <w:t xml:space="preserve">{position}</w:t>
-      </w:r>
-    </w:p>
-    <w:p>
-      <w:pPr>
-        <w:rPr/>
-      </w:pPr>
-      <w:r>
-        <w:rPr>
-          <w:rtl w:val="0"/>
-        </w:rPr>
-        <w:t xml:space="preserve">{duration}</w:t>
-      </w:r>
-    </w:p>
-    <w:p>
-      <w:pPr>
-        <w:spacing w:line="240" w:lineRule="auto"/>
-        <w:jc w:val="left"/>
-        <w:rPr>
-          <w:sz w:val="18"/>
-          <w:szCs w:val="18"/>
-        </w:rPr>
-      </w:pPr>
-      <w:r>
-        <w:rPr>
-          <w:rtl w:val="0"/>
-        </w:rPr>
-      </w:r>
-    </w:p>
-    <w:p>
-      <w:pPr>
-        <w:rPr/>
-      </w:pPr>
-      <w:r>
-        <w:rPr>
-          <w:rtl w:val="0"/>
-        </w:rPr>
-        <w:t xml:space="preserve">{#highlights}</w:t>
-      </w:r>
-    </w:p>
-    <w:p>
-      <w:pPr>
-        <w:numPr>
-          <w:ilvl w:val="0"/>
-          <w:numId w:val="1"/>
-        </w:numPr>
-        <w:ind w:left="720" w:hanging="360"/>
-        <w:rPr>
-          <w:sz w:val="18"/>
-          <w:szCs w:val="18"/>
-        </w:rPr>
-      </w:pPr>
-      <w:r>
-        <w:rPr>
-          <w:rtl w:val="0"/>
-        </w:rPr>
-        <w:t xml:space="preserve">{.}</w:t>
-      </w:r>
-    </w:p>
-    <w:p>
-      <w:pPr>
-        <w:rPr/>
-      </w:pPr>
-      <w:r>
-        <w:rPr>
-          <w:rtl w:val="0"/>
-        </w:rPr>
+      <w:r>
         <w:t xml:space="preserve">{/highlights}</w:t>
       </w:r>
     </w:p>
     <w:p>
-      <w:pPr>
-        <w:rPr/>
-      </w:pPr>
-      <w:r>
-        <w:rPr>
-          <w:rtl w:val="0"/>
-        </w:rPr>
+      <w:r>
         <w:t xml:space="preserve">{/experience}</w:t>
-      </w:r>
-    </w:p>
-    <w:p>
-      <w:pPr>
-        <w:ind w:left="720" w:firstLine="0"/>
-        <w:rPr/>
-      </w:pPr>
-      <w:r>
-        <w:rPr>
-          <w:rtl w:val="0"/>
-        </w:rPr>
       </w:r>
     </w:p>
     <w:sectPr>
@@ -727,7 +682,7 @@
         <wp:inline distB="114300" distT="114300" distL="114300" distR="114300">
           <wp:extent cx="314325" cy="190500"/>
           <wp:effectExtent b="0" l="0" r="0" t="0"/>
-          <wp:docPr id="2" name="image1.jpg"/>
+          <wp:docPr id="1" name="image1.jpg"/>
           <a:graphic>
             <a:graphicData uri="http://schemas.openxmlformats.org/drawingml/2006/picture">
               <pic:pic>
@@ -819,6 +774,8 @@
         <w:ind w:left="720" w:hanging="360"/>
       </w:pPr>
       <w:rPr>
+        <w:sz w:val="18"/>
+        <w:szCs w:val="18"/>
         <w:u w:val="none"/>
       </w:rPr>
     </w:lvl>
@@ -929,6 +886,8 @@
         <w:ind w:left="720" w:hanging="360"/>
       </w:pPr>
       <w:rPr>
+        <w:sz w:val="18"/>
+        <w:szCs w:val="18"/>
         <w:u w:val="none"/>
       </w:rPr>
     </w:lvl>

</xml_diff>

<commit_message>
updated color scheme for both
</commit_message>
<xml_diff>
--- a/public/templates/external.docx
+++ b/public/templates/external.docx
@@ -1131,7 +1131,7 @@
     </w:pPr>
     <w:rPr>
       <w:rFonts w:ascii="Lexend Medium" w:cs="Lexend Medium" w:eastAsia="Lexend Medium" w:hAnsi="Lexend Medium"/>
-      <w:color w:val="000000"/>
+      <w:color w:val="373742"/>
       <w:sz w:val="48"/>
       <w:szCs w:val="48"/>
     </w:rPr>
@@ -1148,7 +1148,7 @@
     </w:pPr>
     <w:rPr>
       <w:rFonts w:ascii="Lexend" w:cs="Lexend" w:eastAsia="Lexend" w:hAnsi="Lexend"/>
-      <w:color w:val="000000"/>
+      <w:color w:val="373742"/>
     </w:rPr>
   </w:style>
 </w:styles>

</xml_diff>